<commit_message>
Reconstruye Seminario de Sistemas con pipeline propio (build_uniajc_seminario_all.py)
Igual que Prog II: fuente unica seminario_clases_data.py -> slides, guiones,
talleres, quices y plantillas de artefactos de diseño (no codigo: esta
asignatura entrega planos, no software). Numeracion alineada al plan
2026-2 (parciales en 5/10/15), logos de herramientas renderizando,
prueba diagnostica de Clase 1 restaurada en Seminario y en Programacion II
(se habia perdido en ambas reconstrucciones). Se bloquean los tres
generadores de Clase 1 superados para que no reviertan el contenido nuevo.

Co-Authored-By: Claude Sonnet 5 <noreply@anthropic.com>
</commit_message>
<xml_diff>
--- a/Seminario de Sistemas/Kit docente/Clase 1/Guion Docente Clase 1 - Conceptos iniciales.docx
+++ b/Seminario de Sistemas/Kit docente/Clase 1/Guion Docente Clase 1 - Conceptos iniciales.docx
@@ -43,7 +43,7 @@
           <w:color w:val="4A4A49"/>
           <w:sz w:val="22"/>
         </w:rPr>
-        <w:t>Tipo:</w:t>
+        <w:t>Hilo:</w:t>
       </w:r>
       <w:r>
         <w:rPr>
@@ -51,7 +51,7 @@
           <w:color w:val="4A4A49"/>
           <w:sz w:val="22"/>
         </w:rPr>
-        <w:t xml:space="preserve"> REGULAR · </w:t>
+        <w:t xml:space="preserve"> Proyecto Integrador </w:t>
       </w:r>
       <w:r>
         <w:rPr>
@@ -59,7 +59,7 @@
           <w:color w:val="4A4A49"/>
           <w:sz w:val="22"/>
         </w:rPr>
-        <w:t>presencial</w:t>
+        <w:t>VetCare</w:t>
       </w:r>
       <w:r>
         <w:rPr>
@@ -67,7 +67,7 @@
           <w:color w:val="4A4A49"/>
           <w:sz w:val="22"/>
         </w:rPr>
-        <w:t xml:space="preserve"> (Clase 1 siempre es presencial)</w:t>
+        <w:t xml:space="preserve"> — planos del sistema de la clinica «Huellitas»</w:t>
       </w:r>
     </w:p>
     <w:p>
@@ -80,7 +80,7 @@
           <w:color w:val="4A4A49"/>
           <w:sz w:val="22"/>
         </w:rPr>
-        <w:t>Dia 1:</w:t>
+        <w:t>Hoy avanzamos el PI en:</w:t>
       </w:r>
       <w:r>
         <w:rPr>
@@ -88,33 +88,7 @@
           <w:color w:val="4A4A49"/>
           <w:sz w:val="22"/>
         </w:rPr>
-        <w:t xml:space="preserve"> este bloque comparte espacio con la </w:t>
-      </w:r>
-      <w:r>
-        <w:rPr>
-          <w:b/>
-          <w:color w:val="4A4A49"/>
-          <w:sz w:val="22"/>
-        </w:rPr>
-        <w:t>Sesion 0</w:t>
-      </w:r>
-      <w:r>
-        <w:rPr>
-          <w:b w:val="0"/>
-          <w:color w:val="4A4A49"/>
-          <w:sz w:val="22"/>
-        </w:rPr>
-        <w:t xml:space="preserve"> (Presentacion del Curso,</w:t>
-      </w:r>
-    </w:p>
-    <w:p>
-      <w:r>
-        <w:rPr>
-          <w:b w:val="0"/>
-          <w:color w:val="4A4A49"/>
-          <w:sz w:val="22"/>
-        </w:rPr>
-        <w:t>archivo aparte). Sesion 0 = logistica y encuadre; esta Clase 1 = diagnostico + primer tema.</w:t>
+        <w:t xml:space="preserve"> Equipo conformado y dominio del proyecto acotado</w:t>
       </w:r>
     </w:p>
     <w:p>
@@ -135,7 +109,28 @@
           <w:color w:val="4A4A49"/>
           <w:sz w:val="22"/>
         </w:rPr>
-        <w:t xml:space="preserve"> equipo conformado + dominio del proyecto elegido y acotado</w:t>
+        <w:t xml:space="preserve"> Ficha del equipo: problema en 2-3 frases, 3-5 capacidades, 2-3 actores y lo que queda fuera de alcance</w:t>
+      </w:r>
+    </w:p>
+    <w:p>
+      <w:pPr>
+        <w:pStyle w:val="ListBullet"/>
+      </w:pPr>
+      <w:r>
+        <w:rPr>
+          <w:b/>
+          <w:color w:val="4A4A49"/>
+          <w:sz w:val="22"/>
+        </w:rPr>
+        <w:t>Herramienta:</w:t>
+      </w:r>
+      <w:r>
+        <w:rPr>
+          <w:b w:val="0"/>
+          <w:color w:val="4A4A49"/>
+          <w:sz w:val="22"/>
+        </w:rPr>
+        <w:t xml:space="preserve"> Google Docs · draw.io</w:t>
       </w:r>
     </w:p>
     <w:p>
@@ -179,22 +174,7 @@
           <w:color w:val="4A4A49"/>
           <w:sz w:val="21"/>
         </w:rPr>
-        <w:t>Sin mapa completo del curso, sin bio del docente, sin fechas de periodo:</w:t>
-      </w:r>
-    </w:p>
-    <w:p>
-      <w:pPr>
-        <w:ind w:left="432"/>
-        <w:shd w:val="clear" w:fill="F7F7F8"/>
-      </w:pPr>
-      <w:r>
-        <w:rPr>
-          <w:b w:val="0"/>
-          <w:i/>
-          <w:color w:val="4A4A49"/>
-          <w:sz w:val="21"/>
-        </w:rPr>
-        <w:t>todo eso ya se cubrio en la Sesion 0.</w:t>
+        <w:t>Sin mapa del curso, sin bio del docente, sin fechas de periodo: eso vive en la Sesion 0.</w:t>
       </w:r>
     </w:p>
     <w:p>
@@ -213,19 +193,11 @@
     <w:p>
       <w:r>
         <w:rPr>
-          <w:b/>
-          <w:color w:val="4A4A49"/>
-          <w:sz w:val="22"/>
-        </w:rPr>
-        <w:t>Que es la ingenieria de software y por que no es "programar".</w:t>
-      </w:r>
-      <w:r>
-        <w:rPr>
           <w:b w:val="0"/>
           <w:color w:val="4A4A49"/>
           <w:sz w:val="22"/>
         </w:rPr>
-        <w:t xml:space="preserve"> Programar es</w:t>
+        <w:t>Programar es escribir codigo que funcione hoy. La ingenieria de software es el conjunto de practicas que hacen que ese codigo siga funcionando cuando el sistema crece, cuando lo mantiene otra persona y cuando los requisitos cambian. La diferencia no es filosofica sino economica: un error detectado al analizar requisitos cuesta corregirlo una fraccion de lo que cuesta corregirlo en produccion, cuando ya hay usuarios reales dependiendo del sistema. Esa curva de costo es la justificacion de todo lo que se vera en este curso; sin ella, las metodologias suenan a burocracia arbitraria.</w:t>
       </w:r>
     </w:p>
     <w:p>
@@ -235,7 +207,7 @@
           <w:color w:val="4A4A49"/>
           <w:sz w:val="22"/>
         </w:rPr>
-        <w:t>escribir codigo que funcione. La ingenieria de software es el conjunto de practicas</w:t>
+        <w:t>Conviene separar dos palabras que se usan como sinonimos y no lo son. El producto es el software y su documentacion: lo que queda cuando todos se van. El proyecto es el esfuerzo acotado en tiempo y recursos para construirlo. Un proyecto termina; un producto puede seguir vivo diez años. Confundirlos lleva al equipo a pensar «ya entregamos, ya terminamos» y a no dejar nada escrito para quien venga despues. En VetCare, el proyecto es el semestre; el producto es el sistema que la clinica Huellitas usaria todos los dias.</w:t>
       </w:r>
     </w:p>
     <w:p>
@@ -245,7 +217,7 @@
           <w:color w:val="4A4A49"/>
           <w:sz w:val="22"/>
         </w:rPr>
-        <w:t>que hacen que ese codigo siga funcionando cuando el sistema crece, cuando lo mantiene</w:t>
+        <w:t>Un requisito funcional dice QUE debe hacer el sistema: «registrar una mascota con ID, nombre y especie». Un requisito no funcional dice COMO debe comportarse: «la busqueda de un expediente responde en menos de dos segundos», «la informacion no se pierde ante un corte de energia». Los no funcionales son los que mas se olvidan y, paradojicamente, los que mas condicionan la arquitectura. La regla practica que el estudiante debe interiorizar desde hoy es: si no se puede verificar, no es un requisito, es un deseo. «El sistema debe ser rapido» no sirve; «responde en menos de 2 s con 50 usuarios simultaneos» si, porque alguien puede sentarse a comprobarlo.</w:t>
       </w:r>
     </w:p>
     <w:p>
@@ -255,7 +227,7 @@
           <w:color w:val="4A4A49"/>
           <w:sz w:val="22"/>
         </w:rPr>
-        <w:t>otra persona y cuando los requisitos cambian. La diferencia se nota en el costo: un</w:t>
+        <w:t>Los interesados no son solo quien paga. En la clinica Huellitas hay al menos tres con intereses distintos: el dueño de la clinica quiere metricas del negocio, la recepcionista quiere agendar rapido y con pocos clics, y el veterinario quiere el historial del paciente a la mano durante la consulta. Esos intereses entran en conflicto: pedir mas datos da mejores metricas al dueño pero vuelve mas lento el registro para la recepcionista. Resolver ese conflicto, decidiendo que se prioriza y documentando por que, es trabajo de analisis, no de programacion.</w:t>
       </w:r>
     </w:p>
     <w:p>
@@ -265,7 +237,7 @@
           <w:color w:val="4A4A49"/>
           <w:sz w:val="22"/>
         </w:rPr>
-        <w:t>error detectado al analizar requisitos cuesta corregirlo una fraccion de lo que</w:t>
+        <w:t>Todo desarrollo pasa por las mismas fases —requisitos, diseño, construccion, pruebas, mantenimiento— y lo que cambia entre metodologias no son las fases sino COMO se recorren: una sola vez y en orden (cascada) o en ciclos cortos que repiten todas las fases (iterativo y agil). Hoy solo se nombran; se comparan a fondo en las Clases 2, 3 y 4. Lo importante del primer dia es que el estudiante entienda su rol en esta asignatura: aqui no se construye la casa, se dibujan los planos para que cualquier equipo pueda construirla. Decirlo explicitamente evita que quien esperaba programar se frustre a mitad de semestre.</w:t>
       </w:r>
     </w:p>
     <w:p>
@@ -275,7 +247,7 @@
           <w:color w:val="4A4A49"/>
           <w:sz w:val="22"/>
         </w:rPr>
-        <w:t>cuesta corregirlo en produccion. Esa es la justificacion economica de todo lo que se</w:t>
+        <w:t>Queda una pregunta que el estudiante hace el primer dia y conviene responder sin rodeos: para que sirve documentar si al final lo que se usa es el codigo. La respuesta esta en quien lee. El codigo lo lee la maquina y quien ya conoce el sistema; los planos los lee quien todavia no lo conoce: el companero que entra a mitad de semestre, el docente que califica, el equipo de Programacion II que va a construir VetCare a partir de estos documentos, y usted mismo dentro de seis semanas cuando ya no recuerde por que decidio lo que decidio. Documentar no es escribir bonito ni llenar plantillas: es dejar por escrito las decisiones y su justificacion, de modo que otro pueda continuar sin volver a entrevistar al cliente. Por eso en este curso cada entregable tiene un lector concreto, y la pregunta que se hace al calificar no es cuantas paginas tiene sino si ese lector podria trabajar con el sin preguntarle nada al autor.</w:t>
       </w:r>
     </w:p>
     <w:p>
@@ -285,7 +257,17 @@
           <w:color w:val="4A4A49"/>
           <w:sz w:val="22"/>
         </w:rPr>
-        <w:t>vera en este curso.</w:t>
+        <w:t>Conviene tambien aclarar el mapa del semestre en una sola frase, porque de eso depende que el estudiante sepa donde esta parado en cada clase. Las primeras cuatro clases responden como se organiza el trabajo (ciclos de vida, metodologias tradicionales y agiles); de la sexta a la novena, que debe hacer el sistema (requisitos, historias de usuario, UML y casos de uso); de la once a la catorce, como se ve y como se sustenta (auditoria del avance, diagramas dinamicos, interfaces y sustentacion). Las clases 5, 10 y 15 son de parcial. Todo lo que se produzca en el camino se acumula en un unico paquete de diseno del proyecto VetCare, que es el entregable real de la asignatura; no hay trabajos sueltos que se boten al terminar la clase. Decir esto el primer dia evita la sensacion de estar haciendo tareas desconectadas.</w:t>
+      </w:r>
+    </w:p>
+    <w:p>
+      <w:r>
+        <w:rPr>
+          <w:b w:val="0"/>
+          <w:color w:val="4A4A49"/>
+          <w:sz w:val="22"/>
+        </w:rPr>
+        <w:t>Error tipico del docente que no domina el tema: empezar por las metodologias (cascada, Scrum) antes de que el estudiante entienda que problema resuelven. Sin la nocion de que el costo del error crece con el tiempo, Scrum se percibe como una serie de reuniones sin sentido y la documentacion como relleno para la nota. El segundo tropiezo es aceptar requisitos no verificables en la primera entrega («el sistema debe ser amigable»): si no se corrige el primer dia, ese vicio contamina los casos de uso, las pruebas y la sustentacion final.</w:t>
       </w:r>
     </w:p>
     <w:p>
@@ -295,7 +277,7 @@
           <w:color w:val="4A4A49"/>
           <w:sz w:val="22"/>
         </w:rPr>
-        <w:t>Producto vs proyecto.</w:t>
+        <w:t>Demo que usted debe poder repetir:</w:t>
       </w:r>
       <w:r>
         <w:rPr>
@@ -303,365 +285,7 @@
           <w:color w:val="4A4A49"/>
           <w:sz w:val="22"/>
         </w:rPr>
-        <w:t xml:space="preserve"> El *producto* es el software (y su documentacion). El</w:t>
-      </w:r>
-    </w:p>
-    <w:p>
-      <w:r>
-        <w:rPr>
-          <w:b w:val="0"/>
-          <w:color w:val="4A4A49"/>
-          <w:sz w:val="22"/>
-        </w:rPr>
-        <w:t>*proyecto* es el esfuerzo acotado en tiempo y recursos para construirlo. Un proyecto</w:t>
-      </w:r>
-    </w:p>
-    <w:p>
-      <w:r>
-        <w:rPr>
-          <w:b w:val="0"/>
-          <w:color w:val="4A4A49"/>
-          <w:sz w:val="22"/>
-        </w:rPr>
-        <w:t>puede terminar y el producto seguir vivo durante años. Confundirlos lleva a creer que</w:t>
-      </w:r>
-    </w:p>
-    <w:p>
-      <w:r>
-        <w:rPr>
-          <w:b w:val="0"/>
-          <w:color w:val="4A4A49"/>
-          <w:sz w:val="22"/>
-        </w:rPr>
-        <w:t>"entregamos, ya terminamos".</w:t>
-      </w:r>
-    </w:p>
-    <w:p>
-      <w:r>
-        <w:rPr>
-          <w:b/>
-          <w:color w:val="4A4A49"/>
-          <w:sz w:val="22"/>
-        </w:rPr>
-        <w:t>Requisitos funcionales vs no funcionales.</w:t>
-      </w:r>
-      <w:r>
-        <w:rPr>
-          <w:b w:val="0"/>
-          <w:color w:val="4A4A49"/>
-          <w:sz w:val="22"/>
-        </w:rPr>
-        <w:t xml:space="preserve"> Un requisito funcional dice QUE debe</w:t>
-      </w:r>
-    </w:p>
-    <w:p>
-      <w:r>
-        <w:rPr>
-          <w:b w:val="0"/>
-          <w:color w:val="4A4A49"/>
-          <w:sz w:val="22"/>
-        </w:rPr>
-        <w:t>hacer el sistema ("registrar una mascota con ID, nombre y especie"). Uno no funcional</w:t>
-      </w:r>
-    </w:p>
-    <w:p>
-      <w:r>
-        <w:rPr>
-          <w:b w:val="0"/>
-          <w:color w:val="4A4A49"/>
-          <w:sz w:val="22"/>
-        </w:rPr>
-        <w:t>dice COMO debe comportarse ("la busqueda de un expediente responde en menos de 2</w:t>
-      </w:r>
-    </w:p>
-    <w:p>
-      <w:r>
-        <w:rPr>
-          <w:b w:val="0"/>
-          <w:color w:val="4A4A49"/>
-          <w:sz w:val="22"/>
-        </w:rPr>
-        <w:t>segundos", "la informacion no se pierde ante un corte de energia"). Los no funcionales</w:t>
-      </w:r>
-    </w:p>
-    <w:p>
-      <w:r>
-        <w:rPr>
-          <w:b w:val="0"/>
-          <w:color w:val="4A4A49"/>
-          <w:sz w:val="22"/>
-        </w:rPr>
-        <w:t>son los que mas se olvidan y los que mas arquitectura condicionan. Regla practica para</w:t>
-      </w:r>
-    </w:p>
-    <w:p>
-      <w:r>
-        <w:rPr>
-          <w:b w:val="0"/>
-          <w:color w:val="4A4A49"/>
-          <w:sz w:val="22"/>
-        </w:rPr>
-        <w:t>el estudiante: si no se puede verificar, no es un requisito — es un deseo. «El sistema</w:t>
-      </w:r>
-    </w:p>
-    <w:p>
-      <w:r>
-        <w:rPr>
-          <w:b w:val="0"/>
-          <w:color w:val="4A4A49"/>
-          <w:sz w:val="22"/>
-        </w:rPr>
-        <w:t>debe ser rapido» no es requisito; «responde en menos de 2 s con 50 usuarios» si lo es.</w:t>
-      </w:r>
-    </w:p>
-    <w:p>
-      <w:r>
-        <w:rPr>
-          <w:b/>
-          <w:color w:val="4A4A49"/>
-          <w:sz w:val="22"/>
-        </w:rPr>
-        <w:t>Interesados (stakeholders).</w:t>
-      </w:r>
-      <w:r>
-        <w:rPr>
-          <w:b w:val="0"/>
-          <w:color w:val="4A4A49"/>
-          <w:sz w:val="22"/>
-        </w:rPr>
-        <w:t xml:space="preserve"> No solo el que paga. En la clinica veterinaria del</w:t>
-      </w:r>
-    </w:p>
-    <w:p>
-      <w:r>
-        <w:rPr>
-          <w:b w:val="0"/>
-          <w:color w:val="4A4A49"/>
-          <w:sz w:val="22"/>
-        </w:rPr>
-        <w:t>proyecto hay al menos tres: el dueño de la clinica (quiere metricas), la recepcionista</w:t>
-      </w:r>
-    </w:p>
-    <w:p>
-      <w:r>
-        <w:rPr>
-          <w:b w:val="0"/>
-          <w:color w:val="4A4A49"/>
-          <w:sz w:val="22"/>
-        </w:rPr>
-        <w:t>(quiere agendar rapido) y el veterinario (quiere el historial a la mano). Sus intereses</w:t>
-      </w:r>
-    </w:p>
-    <w:p>
-      <w:r>
-        <w:rPr>
-          <w:b w:val="0"/>
-          <w:color w:val="4A4A49"/>
-          <w:sz w:val="22"/>
-        </w:rPr>
-        <w:t>pueden entrar en conflicto, y resolver ese conflicto es trabajo de analisis, no de</w:t>
-      </w:r>
-    </w:p>
-    <w:p>
-      <w:r>
-        <w:rPr>
-          <w:b w:val="0"/>
-          <w:color w:val="4A4A49"/>
-          <w:sz w:val="22"/>
-        </w:rPr>
-        <w:t>programacion.</w:t>
-      </w:r>
-    </w:p>
-    <w:p>
-      <w:r>
-        <w:rPr>
-          <w:b/>
-          <w:color w:val="4A4A49"/>
-          <w:sz w:val="22"/>
-        </w:rPr>
-        <w:t>Ciclo de vida del software (introduccion).</w:t>
-      </w:r>
-      <w:r>
-        <w:rPr>
-          <w:b w:val="0"/>
-          <w:color w:val="4A4A49"/>
-          <w:sz w:val="22"/>
-        </w:rPr>
-        <w:t xml:space="preserve"> Todo desarrollo pasa por las mismas</w:t>
-      </w:r>
-    </w:p>
-    <w:p>
-      <w:r>
-        <w:rPr>
-          <w:b w:val="0"/>
-          <w:color w:val="4A4A49"/>
-          <w:sz w:val="22"/>
-        </w:rPr>
-        <w:t>fases —requisitos, diseño, construccion, pruebas, mantenimiento— y lo que cambia entre</w:t>
-      </w:r>
-    </w:p>
-    <w:p>
-      <w:r>
-        <w:rPr>
-          <w:b w:val="0"/>
-          <w:color w:val="4A4A49"/>
-          <w:sz w:val="22"/>
-        </w:rPr>
-        <w:t>metodologias es COMO se recorren: una sola vez y en orden (cascada) o en ciclos cortos</w:t>
-      </w:r>
-    </w:p>
-    <w:p>
-      <w:r>
-        <w:rPr>
-          <w:b w:val="0"/>
-          <w:color w:val="4A4A49"/>
-          <w:sz w:val="22"/>
-        </w:rPr>
-        <w:t>que repiten todas las fases (iterativo/agil). Hoy solo se nombran; se comparan a fondo</w:t>
-      </w:r>
-    </w:p>
-    <w:p>
-      <w:r>
-        <w:rPr>
-          <w:b w:val="0"/>
-          <w:color w:val="4A4A49"/>
-          <w:sz w:val="22"/>
-        </w:rPr>
-        <w:t>en las Clases 2, 3 y 4.</w:t>
-      </w:r>
-    </w:p>
-    <w:p>
-      <w:r>
-        <w:rPr>
-          <w:b/>
-          <w:color w:val="4A4A49"/>
-          <w:sz w:val="22"/>
-        </w:rPr>
-        <w:t>El rol del estudiante en este curso.</w:t>
-      </w:r>
-      <w:r>
-        <w:rPr>
-          <w:b w:val="0"/>
-          <w:color w:val="4A4A49"/>
-          <w:sz w:val="22"/>
-        </w:rPr>
-        <w:t xml:space="preserve"> Aqui no se construye el software: se diseñan</w:t>
-      </w:r>
-    </w:p>
-    <w:p>
-      <w:r>
-        <w:rPr>
-          <w:b w:val="0"/>
-          <w:color w:val="4A4A49"/>
-          <w:sz w:val="22"/>
-        </w:rPr>
-        <w:t>los planos. Es la diferencia entre el arquitecto y el maestro de obra. Conviene decirlo</w:t>
-      </w:r>
-    </w:p>
-    <w:p>
-      <w:r>
-        <w:rPr>
-          <w:b w:val="0"/>
-          <w:color w:val="4A4A49"/>
-          <w:sz w:val="22"/>
-        </w:rPr>
-        <w:t>explicitamente el primer dia, porque un estudiante que espera programar se frustra, y</w:t>
-      </w:r>
-    </w:p>
-    <w:p>
-      <w:r>
-        <w:rPr>
-          <w:b w:val="0"/>
-          <w:color w:val="4A4A49"/>
-          <w:sz w:val="22"/>
-        </w:rPr>
-        <w:t>uno que entiende el rol valora el entregable.</w:t>
-      </w:r>
-    </w:p>
-    <w:p>
-      <w:r>
-        <w:rPr>
-          <w:b/>
-          <w:color w:val="4A4A49"/>
-          <w:sz w:val="22"/>
-        </w:rPr>
-        <w:t>Error tipico del docente que no domina el tema:</w:t>
-      </w:r>
-      <w:r>
-        <w:rPr>
-          <w:b w:val="0"/>
-          <w:color w:val="4A4A49"/>
-          <w:sz w:val="22"/>
-        </w:rPr>
-        <w:t xml:space="preserve"> empezar por las metodologias</w:t>
-      </w:r>
-    </w:p>
-    <w:p>
-      <w:r>
-        <w:rPr>
-          <w:b w:val="0"/>
-          <w:color w:val="4A4A49"/>
-          <w:sz w:val="22"/>
-        </w:rPr>
-        <w:t>(cascada, Scrum) antes de que el estudiante entienda que problema resuelven. Sin la</w:t>
-      </w:r>
-    </w:p>
-    <w:p>
-      <w:r>
-        <w:rPr>
-          <w:b w:val="0"/>
-          <w:color w:val="4A4A49"/>
-          <w:sz w:val="22"/>
-        </w:rPr>
-        <w:t>nocion de "el costo del error crece con el tiempo", las metodologias suenan a</w:t>
-      </w:r>
-    </w:p>
-    <w:p>
-      <w:r>
-        <w:rPr>
-          <w:b w:val="0"/>
-          <w:color w:val="4A4A49"/>
-          <w:sz w:val="22"/>
-        </w:rPr>
-        <w:t>burocracia arbitraria.</w:t>
-      </w:r>
-    </w:p>
-    <w:p>
-      <w:r>
-        <w:rPr>
-          <w:b/>
-          <w:color w:val="4A4A49"/>
-          <w:sz w:val="22"/>
-        </w:rPr>
-        <w:t>Sobre el diagnostico de hoy:</w:t>
-      </w:r>
-      <w:r>
-        <w:rPr>
-          <w:b w:val="0"/>
-          <w:color w:val="4A4A49"/>
-          <w:sz w:val="22"/>
-        </w:rPr>
-        <w:t xml:space="preserve"> no es una nota. Sirve para saber si el grupo llega con</w:t>
-      </w:r>
-    </w:p>
-    <w:p>
-      <w:r>
-        <w:rPr>
-          <w:b w:val="0"/>
-          <w:color w:val="4A4A49"/>
-          <w:sz w:val="22"/>
-        </w:rPr>
-        <w:t>nociones de UML, de requisitos o de trabajo en equipo. El resultado ajusta la</w:t>
-      </w:r>
-    </w:p>
-    <w:p>
-      <w:r>
-        <w:rPr>
-          <w:b w:val="0"/>
-          <w:color w:val="4A4A49"/>
-          <w:sz w:val="22"/>
-        </w:rPr>
-        <w:t>profundidad de las Clases 2 a 4.</w:t>
+        <w:t xml:space="preserve"> Convertir en vivo la frase cruda «necesito buscar rapido el expediente de un animal» en un requisito funcional y uno no funcional bien escritos</w:t>
       </w:r>
     </w:p>
     <w:p>
@@ -687,7 +311,7 @@
           <w:color w:val="1A1C1D"/>
           <w:sz w:val="32"/>
         </w:rPr>
-        <w:t>0-15 · Enlace con la Sesion 0 y encuadre del tema</w:t>
+        <w:t>0-10 · Encuadre</w:t>
       </w:r>
     </w:p>
     <w:p>
@@ -705,7 +329,7 @@
           <w:color w:val="4A4A49"/>
           <w:sz w:val="22"/>
         </w:rPr>
-        <w:t xml:space="preserve"> «Ya vimos como funciona el curso. Ahora arrancamos el primer tema. Y algo</w:t>
+        <w:t xml:space="preserve"> «Hoy avanzamos VetCare en: Equipo conformado y dominio del proyecto acotado. La teoria es corta; el peso esta en</w:t>
       </w:r>
     </w:p>
     <w:p>
@@ -715,7 +339,7 @@
           <w:color w:val="4A4A49"/>
           <w:sz w:val="22"/>
         </w:rPr>
-        <w:t>importante desde hoy: en esta materia ustedes no van a programar; van a diseñar. Su</w:t>
+        <w:t>el taller del proyecto.»</w:t>
       </w:r>
     </w:p>
     <w:p>
@@ -725,7 +349,7 @@
           <w:color w:val="4A4A49"/>
           <w:sz w:val="22"/>
         </w:rPr>
-        <w:t>producto son los planos que otro equipo podria construir.»</w:t>
+        <w:t>Pasar asistencia. Recordar donde quedo el avance de la clase pasada.</w:t>
       </w:r>
     </w:p>
     <w:p>
@@ -738,7 +362,7 @@
           <w:color w:val="1A1C1D"/>
           <w:sz w:val="32"/>
         </w:rPr>
-        <w:t>15-35 · Prueba diagnostica</w:t>
+        <w:t>10-40 · Teoria Core</w:t>
       </w:r>
     </w:p>
     <w:p>
@@ -748,23 +372,40 @@
           <w:color w:val="4A4A49"/>
           <w:sz w:val="22"/>
         </w:rPr>
-        <w:t xml:space="preserve">Aplicar </w:t>
+        <w:t>Cubrir el fundamento de arriba apoyandose en la slide «Teoria Core» y en la de codigo</w:t>
       </w:r>
-      <w:r>
-        <w:rPr>
-          <w:rFonts w:ascii="Consolas" w:hAnsi="Consolas"/>
-          <w:color w:val="111111"/>
-          <w:sz w:val="21"/>
-        </w:rPr>
-        <w:t>Kit docente/Clase 1/Prueba Diagnostica…</w:t>
-      </w:r>
+    </w:p>
+    <w:p>
       <w:r>
         <w:rPr>
           <w:b w:val="0"/>
           <w:color w:val="4A4A49"/>
           <w:sz w:val="22"/>
         </w:rPr>
-        <w:t>. Individual, sin nota.</w:t>
+        <w:t>proyectable. Cada 8-10 min, amarrar al producto: «esto es lo que van a dejar hoy en VetCare».</w:t>
+      </w:r>
+    </w:p>
+    <w:p>
+      <w:r>
+        <w:rPr>
+          <w:b w:val="0"/>
+          <w:color w:val="4A4A49"/>
+          <w:sz w:val="22"/>
+        </w:rPr>
+        <w:t>Pregunta al aire (2 min): ¿donde encaja esto en el VetCare de su equipo?</w:t>
+      </w:r>
+    </w:p>
+    <w:p>
+      <w:pPr>
+        <w:spacing w:before="200" w:after="60"/>
+      </w:pPr>
+      <w:r>
+        <w:rPr>
+          <w:b/>
+          <w:color w:val="1A1C1D"/>
+          <w:sz w:val="32"/>
+        </w:rPr>
+        <w:t>40-60 · Demo en vivo</w:t>
       </w:r>
     </w:p>
     <w:p>
@@ -782,7 +423,7 @@
           <w:color w:val="4A4A49"/>
           <w:sz w:val="22"/>
         </w:rPr>
-        <w:t xml:space="preserve"> «No se califica. Me sirve para calibrar el ritmo.»</w:t>
+        <w:t xml:space="preserve"> «Miren mi pantalla. Dominio VetCare — no otro ejemplo.»</w:t>
       </w:r>
     </w:p>
     <w:p>
@@ -792,7 +433,27 @@
           <w:color w:val="4A4A49"/>
           <w:sz w:val="22"/>
         </w:rPr>
-        <w:t>Mientras responden, pasar asistencia.</w:t>
+        <w:t>Demo: Convertir en vivo la frase cruda «necesito buscar rapido el expediente de un animal» en un requisito funcional y uno no funcional bien escritos</w:t>
+      </w:r>
+    </w:p>
+    <w:p>
+      <w:r>
+        <w:rPr>
+          <w:b w:val="0"/>
+          <w:color w:val="4A4A49"/>
+          <w:sz w:val="22"/>
+        </w:rPr>
+        <w:t>Escribir el codigo en vivo (no copiar-pegar). Codigo de apoyo:</w:t>
+      </w:r>
+    </w:p>
+    <w:p>
+      <w:r>
+        <w:rPr>
+          <w:rFonts w:ascii="Consolas" w:hAnsi="Consolas"/>
+          <w:color w:val="111111"/>
+          <w:sz w:val="21"/>
+        </w:rPr>
+        <w:t>Kit docente/Clase 1/Plantillas/Ficha de dominio - VetCare.md</w:t>
       </w:r>
     </w:p>
     <w:p>
@@ -805,256 +466,7 @@
           <w:color w:val="1A1C1D"/>
           <w:sz w:val="32"/>
         </w:rPr>
-        <w:t>35-70 · Teoria Core: que es ingenieria de software</w:t>
-      </w:r>
-    </w:p>
-    <w:p>
-      <w:r>
-        <w:rPr>
-          <w:b w:val="0"/>
-          <w:color w:val="4A4A49"/>
-          <w:sz w:val="22"/>
-        </w:rPr>
-        <w:t>Apoyarse en el fundamento de arriba, en este orden:</w:t>
-      </w:r>
-    </w:p>
-    <w:p>
-      <w:pPr>
-        <w:pStyle w:val="ListNumber"/>
-      </w:pPr>
-      <w:r>
-        <w:rPr>
-          <w:b w:val="0"/>
-          <w:color w:val="4A4A49"/>
-          <w:sz w:val="22"/>
-        </w:rPr>
-        <w:t>Programar vs hacer ingenieria (el argumento del costo del error).</w:t>
-      </w:r>
-    </w:p>
-    <w:p>
-      <w:pPr>
-        <w:pStyle w:val="ListNumber"/>
-      </w:pPr>
-      <w:r>
-        <w:rPr>
-          <w:b w:val="0"/>
-          <w:color w:val="4A4A49"/>
-          <w:sz w:val="22"/>
-        </w:rPr>
-        <w:t>Producto vs proyecto.</w:t>
-      </w:r>
-    </w:p>
-    <w:p>
-      <w:pPr>
-        <w:pStyle w:val="ListNumber"/>
-      </w:pPr>
-      <w:r>
-        <w:rPr>
-          <w:b w:val="0"/>
-          <w:color w:val="4A4A49"/>
-          <w:sz w:val="22"/>
-        </w:rPr>
-        <w:t>Requisitos funcionales vs no funcionales, con la regla «si no se puede verificar,</w:t>
-      </w:r>
-    </w:p>
-    <w:p>
-      <w:r>
-        <w:rPr>
-          <w:b w:val="0"/>
-          <w:color w:val="4A4A49"/>
-          <w:sz w:val="22"/>
-        </w:rPr>
-        <w:t>no es un requisito».</w:t>
-      </w:r>
-    </w:p>
-    <w:p>
-      <w:pPr>
-        <w:pStyle w:val="ListNumber"/>
-      </w:pPr>
-      <w:r>
-        <w:rPr>
-          <w:b w:val="0"/>
-          <w:color w:val="4A4A49"/>
-          <w:sz w:val="22"/>
-        </w:rPr>
-        <w:t>Interesados: los tres de la clinica veterinaria y sus intereses en conflicto.</w:t>
-      </w:r>
-    </w:p>
-    <w:p>
-      <w:pPr>
-        <w:pStyle w:val="ListNumber"/>
-      </w:pPr>
-      <w:r>
-        <w:rPr>
-          <w:b w:val="0"/>
-          <w:color w:val="4A4A49"/>
-          <w:sz w:val="22"/>
-        </w:rPr>
-        <w:t>Ciclo de vida: nombrar las fases, sin entrar aun en metodologias.</w:t>
-      </w:r>
-    </w:p>
-    <w:p>
-      <w:r>
-        <w:rPr>
-          <w:b w:val="0"/>
-          <w:color w:val="4A4A49"/>
-          <w:sz w:val="22"/>
-        </w:rPr>
-        <w:t>Ejercicio corto en el tablero (5 min): dar la frase cruda «necesito buscar rapido el</w:t>
-      </w:r>
-    </w:p>
-    <w:p>
-      <w:r>
-        <w:rPr>
-          <w:b w:val="0"/>
-          <w:color w:val="4A4A49"/>
-          <w:sz w:val="22"/>
-        </w:rPr>
-        <w:t>expediente de un animal» y convertirla entre todos en un RF y un RNF bien escritos.</w:t>
-      </w:r>
-    </w:p>
-    <w:p>
-      <w:pPr>
-        <w:spacing w:before="200" w:after="60"/>
-      </w:pPr>
-      <w:r>
-        <w:rPr>
-          <w:b/>
-          <w:color w:val="1A1C1D"/>
-          <w:sz w:val="32"/>
-        </w:rPr>
-        <w:t>70-100 · Taller: conformar equipo y acotar el dominio</w:t>
-      </w:r>
-    </w:p>
-    <w:p>
-      <w:r>
-        <w:rPr>
-          <w:b w:val="0"/>
-          <w:color w:val="4A4A49"/>
-          <w:sz w:val="22"/>
-        </w:rPr>
-        <w:t>En equipos de 2-3:</w:t>
-      </w:r>
-    </w:p>
-    <w:p>
-      <w:pPr>
-        <w:pStyle w:val="ListBullet"/>
-      </w:pPr>
-      <w:r>
-        <w:rPr>
-          <w:b w:val="0"/>
-          <w:color w:val="4A4A49"/>
-          <w:sz w:val="22"/>
-        </w:rPr>
-        <w:t>elegir el dominio del proyecto (por defecto, la clinica veterinaria del PI),</w:t>
-      </w:r>
-    </w:p>
-    <w:p>
-      <w:pPr>
-        <w:pStyle w:val="ListBullet"/>
-      </w:pPr>
-      <w:r>
-        <w:rPr>
-          <w:b w:val="0"/>
-          <w:color w:val="4A4A49"/>
-          <w:sz w:val="22"/>
-        </w:rPr>
-        <w:t>escribir el problema en 2-3 frases,</w:t>
-      </w:r>
-    </w:p>
-    <w:p>
-      <w:pPr>
-        <w:pStyle w:val="ListBullet"/>
-      </w:pPr>
-      <w:r>
-        <w:rPr>
-          <w:b w:val="0"/>
-          <w:color w:val="4A4A49"/>
-          <w:sz w:val="22"/>
-        </w:rPr>
-        <w:t>listar 3-5 capacidades del sistema,</w:t>
-      </w:r>
-    </w:p>
-    <w:p>
-      <w:pPr>
-        <w:pStyle w:val="ListBullet"/>
-      </w:pPr>
-      <w:r>
-        <w:rPr>
-          <w:b w:val="0"/>
-          <w:color w:val="4A4A49"/>
-          <w:sz w:val="22"/>
-        </w:rPr>
-        <w:t>identificar 2-3 actores.</w:t>
-      </w:r>
-    </w:p>
-    <w:p>
-      <w:r>
-        <w:rPr>
-          <w:b w:val="0"/>
-          <w:color w:val="4A4A49"/>
-          <w:sz w:val="22"/>
-        </w:rPr>
-        <w:t xml:space="preserve">Circular por los equipos con un solo criterio: </w:t>
-      </w:r>
-      <w:r>
-        <w:rPr>
-          <w:b/>
-          <w:color w:val="4A4A49"/>
-          <w:sz w:val="22"/>
-        </w:rPr>
-        <w:t>bloquear dominios vagos</w:t>
-      </w:r>
-      <w:r>
-        <w:rPr>
-          <w:b w:val="0"/>
-          <w:color w:val="4A4A49"/>
-          <w:sz w:val="22"/>
-        </w:rPr>
-        <w:t>. Si el</w:t>
-      </w:r>
-    </w:p>
-    <w:p>
-      <w:r>
-        <w:rPr>
-          <w:b w:val="0"/>
-          <w:color w:val="4A4A49"/>
-          <w:sz w:val="22"/>
-        </w:rPr>
-        <w:t>equipo dice «una app para la universidad», no hay problema concreto y todo el semestre</w:t>
-      </w:r>
-    </w:p>
-    <w:p>
-      <w:r>
-        <w:rPr>
-          <w:b w:val="0"/>
-          <w:color w:val="4A4A49"/>
-          <w:sz w:val="22"/>
-        </w:rPr>
-        <w:t>se les vuelve humo. Exigir un actor con un dolor medible.</w:t>
-      </w:r>
-    </w:p>
-    <w:p>
-      <w:pPr>
-        <w:spacing w:before="200" w:after="60"/>
-      </w:pPr>
-      <w:r>
-        <w:rPr>
-          <w:b/>
-          <w:color w:val="1A1C1D"/>
-          <w:sz w:val="32"/>
-        </w:rPr>
-        <w:t>100-115 · Puesta en comun</w:t>
-      </w:r>
-    </w:p>
-    <w:p>
-      <w:r>
-        <w:rPr>
-          <w:b w:val="0"/>
-          <w:color w:val="4A4A49"/>
-          <w:sz w:val="22"/>
-        </w:rPr>
-        <w:t>Dos o tres equipos leen su ficha. El grupo señala que capacidad no se entiende.</w:t>
+        <w:t>60-105 · Taller guiado = avance del PI</w:t>
       </w:r>
     </w:p>
     <w:p>
@@ -1072,7 +484,7 @@
           <w:color w:val="4A4A49"/>
           <w:sz w:val="22"/>
         </w:rPr>
-        <w:t xml:space="preserve"> «Si nosotros no entendemos su sistema en 30 segundos, un programador</w:t>
+        <w:t xml:space="preserve"> «Equipos: abran su proyecto VetCare. Esto suma a la rubrica del PI.»</w:t>
       </w:r>
     </w:p>
     <w:p>
@@ -1082,7 +494,92 @@
           <w:color w:val="4A4A49"/>
           <w:sz w:val="22"/>
         </w:rPr>
-        <w:t>tampoco va a poder construirlo.»</w:t>
+        <w:t>Actividades:</w:t>
+      </w:r>
+    </w:p>
+    <w:p>
+      <w:pPr>
+        <w:pStyle w:val="ListNumber"/>
+      </w:pPr>
+      <w:r>
+        <w:rPr>
+          <w:b w:val="0"/>
+          <w:color w:val="4A4A49"/>
+          <w:sz w:val="22"/>
+        </w:rPr>
+        <w:t>Formen equipo de 2-3 personas y definan quien sera el vocero tecnico del grupo ante el docente.</w:t>
+      </w:r>
+    </w:p>
+    <w:p>
+      <w:pPr>
+        <w:pStyle w:val="ListNumber"/>
+      </w:pPr>
+      <w:r>
+        <w:rPr>
+          <w:b w:val="0"/>
+          <w:color w:val="4A4A49"/>
+          <w:sz w:val="22"/>
+        </w:rPr>
+        <w:t>Escriban el problema en 2-3 frases: quien sufre que, y como se nota hoy ese dolor en la operacion diaria de la clinica.</w:t>
+      </w:r>
+    </w:p>
+    <w:p>
+      <w:pPr>
+        <w:pStyle w:val="ListNumber"/>
+      </w:pPr>
+      <w:r>
+        <w:rPr>
+          <w:b w:val="0"/>
+          <w:color w:val="4A4A49"/>
+          <w:sz w:val="22"/>
+        </w:rPr>
+        <w:t>Listen 3-5 capacidades del sistema, escritas como verbos de negocio (registrar, agendar, consultar), no como pantallas.</w:t>
+      </w:r>
+    </w:p>
+    <w:p>
+      <w:pPr>
+        <w:pStyle w:val="ListNumber"/>
+      </w:pPr>
+      <w:r>
+        <w:rPr>
+          <w:b w:val="0"/>
+          <w:color w:val="4A4A49"/>
+          <w:sz w:val="22"/>
+        </w:rPr>
+        <w:t>Identifiquen 2-3 actores y, para cada uno, que espera obtener del sistema.</w:t>
+      </w:r>
+    </w:p>
+    <w:p>
+      <w:pPr>
+        <w:pStyle w:val="ListNumber"/>
+      </w:pPr>
+      <w:r>
+        <w:rPr>
+          <w:b w:val="0"/>
+          <w:color w:val="4A4A49"/>
+          <w:sz w:val="22"/>
+        </w:rPr>
+        <w:t>Escriban explicitamente que NO hara el sistema este semestre (fuera de alcance): sin esa lista, el proyecto crece sin control.</w:t>
+      </w:r>
+    </w:p>
+    <w:p>
+      <w:r>
+        <w:rPr>
+          <w:b w:val="0"/>
+          <w:color w:val="4A4A49"/>
+          <w:sz w:val="22"/>
+        </w:rPr>
+        <w:t>Circular por los equipos. Empujar evidencia funcionando, no perfeccionismo.</w:t>
+      </w:r>
+    </w:p>
+    <w:p>
+      <w:r>
+        <w:rPr>
+          <w:b w:val="0"/>
+          <w:color w:val="4A4A49"/>
+          <w:sz w:val="22"/>
+        </w:rPr>
+        <w:t>Entregable: Ficha del equipo: problema en 2-3 frases, 3-5 capacidades, 2-3 actores y lo que queda fuera de alcance</w:t>
       </w:r>
     </w:p>
     <w:p>
@@ -1095,7 +592,7 @@
           <w:color w:val="1A1C1D"/>
           <w:sz w:val="32"/>
         </w:rPr>
-        <w:t>115-120 · Cierre y primer contacto con el Proyecto Integrador</w:t>
+        <w:t>105-120 · Criterios de exito y cierre</w:t>
       </w:r>
     </w:p>
     <w:p>
@@ -1105,23 +602,7 @@
           <w:color w:val="4A4A49"/>
           <w:sz w:val="22"/>
         </w:rPr>
-        <w:t>Señalar donde vive el enunciado (</w:t>
-      </w:r>
-      <w:r>
-        <w:rPr>
-          <w:rFonts w:ascii="Consolas" w:hAnsi="Consolas"/>
-          <w:color w:val="111111"/>
-          <w:sz w:val="21"/>
-        </w:rPr>
-        <w:t>Clases/Proyecto Integrador/</w:t>
-      </w:r>
-      <w:r>
-        <w:rPr>
-          <w:b w:val="0"/>
-          <w:color w:val="4A4A49"/>
-          <w:sz w:val="22"/>
-        </w:rPr>
-        <w:t>) y explicar los tres</w:t>
+        <w:t>Repasar el checklist de la slide de criterios.</w:t>
       </w:r>
     </w:p>
     <w:p>
@@ -1131,7 +612,15 @@
           <w:color w:val="4A4A49"/>
           <w:sz w:val="22"/>
         </w:rPr>
-        <w:t>casos segun matricula (cursa ambas materias / solo esta / solo Programacion II).</w:t>
+        <w:t xml:space="preserve">Aplicar el quiz corto de </w:t>
+      </w:r>
+      <w:r>
+        <w:rPr>
+          <w:rFonts w:ascii="Consolas" w:hAnsi="Consolas"/>
+          <w:color w:val="111111"/>
+          <w:sz w:val="21"/>
+        </w:rPr>
+        <w:t>Kit docente/Clase 1/Quiz Clase 1 - VetCare.docx</w:t>
       </w:r>
     </w:p>
     <w:p>
@@ -1141,17 +630,7 @@
           <w:color w:val="4A4A49"/>
           <w:sz w:val="22"/>
         </w:rPr>
-        <w:t>Dejar claro que quien cursa solo Seminario cierra con documento de diseño y prototipo</w:t>
-      </w:r>
-    </w:p>
-    <w:p>
-      <w:r>
-        <w:rPr>
-          <w:b w:val="0"/>
-          <w:color w:val="4A4A49"/>
-          <w:sz w:val="22"/>
-        </w:rPr>
-        <w:t xml:space="preserve">navegable, </w:t>
+        <w:t xml:space="preserve">(la clave va aparte y </w:t>
       </w:r>
       <w:r>
         <w:rPr>
@@ -1159,7 +638,7 @@
           <w:color w:val="4A4A49"/>
           <w:sz w:val="22"/>
         </w:rPr>
-        <w:t>sin escribir codigo</w:t>
+        <w:t>no se proyecta</w:t>
       </w:r>
       <w:r>
         <w:rPr>
@@ -1167,7 +646,25 @@
           <w:color w:val="4A4A49"/>
           <w:sz w:val="22"/>
         </w:rPr>
-        <w:t>: es una ruta completa, no una version reducida.</w:t>
+        <w:t>).</w:t>
+      </w:r>
+    </w:p>
+    <w:p>
+      <w:r>
+        <w:rPr>
+          <w:b/>
+          <w:color w:val="4A4A49"/>
+          <w:sz w:val="22"/>
+        </w:rPr>
+        <w:t>Decir:</w:t>
+      </w:r>
+      <w:r>
+        <w:rPr>
+          <w:b w:val="0"/>
+          <w:color w:val="4A4A49"/>
+          <w:sz w:val="22"/>
+        </w:rPr>
+        <w:t xml:space="preserve"> «Queda avanzado: Equipo conformado y dominio del proyecto acotado. Entrega en ExamLab, domingo 23:59.»</w:t>
       </w:r>
     </w:p>
     <w:p>
@@ -1180,28 +677,17 @@
           <w:color w:val="1A1C1D"/>
           <w:sz w:val="32"/>
         </w:rPr>
-        <w:t>Cierre docente (despues de clase)</w:t>
+        <w:t>Solucion del taller (privada)</w:t>
       </w:r>
     </w:p>
     <w:p>
-      <w:pPr>
-        <w:pStyle w:val="ListBullet"/>
-      </w:pPr>
-      <w:r>
-        <w:rPr>
-          <w:b w:val="0"/>
-          <w:color w:val="4A4A49"/>
-          <w:sz w:val="22"/>
-        </w:rPr>
-        <w:t xml:space="preserve">Revisar el diagnostico y anotar el consolidado en </w:t>
-      </w:r>
       <w:r>
         <w:rPr>
           <w:rFonts w:ascii="Consolas" w:hAnsi="Consolas"/>
           <w:color w:val="111111"/>
           <w:sz w:val="21"/>
         </w:rPr>
-        <w:t>Entregas docente/&lt;periodo&gt;/DIAGNOSTICO…</w:t>
+        <w:t>Kit docente/Clase 1/Solucion Taller Clase 1 - VetCare.docx</w:t>
       </w:r>
       <w:r>
         <w:rPr>
@@ -1209,20 +695,7 @@
           <w:color w:val="4A4A49"/>
           <w:sz w:val="22"/>
         </w:rPr>
-        <w:t>.</w:t>
-      </w:r>
-    </w:p>
-    <w:p>
-      <w:pPr>
-        <w:pStyle w:val="ListBullet"/>
-      </w:pPr>
-      <w:r>
-        <w:rPr>
-          <w:b w:val="0"/>
-          <w:color w:val="4A4A49"/>
-          <w:sz w:val="22"/>
-        </w:rPr>
-        <w:t>Anotar que equipos quedaron con el dominio aun sin acotar: hay que cerrarlo en la Clase 2.</w:t>
+        <w:t xml:space="preserve"> — no proyectar completa.</w:t>
       </w:r>
     </w:p>
     <w:sectPr>

</xml_diff>